<commit_message>
Align weekly progress and meeting slides with the Week 2 calendar
Define Week 1 as 28 September–4 October and Week 2 as 5–11 October,
reviewed at the 12 October meeting. Keep the 5 October report focused
on character-recording foundations and move new hardware and virtual-task
progress into a concise two-page Week 2 PDF, Word document and GitHub report.

Update Current Progress, the report index, project plan and timeline.
Recapture the Data and MuJoCo views with Week 2 demo names and include
board diagnostics, nine magnet runs and pen printing with validation pending.

Validate report links, generator syntax, Word packages and two-page PDF
layouts. Keep all private recordings and synthetic fixtures outside the commit.
</commit_message>
<xml_diff>
--- a/docs/reports/MagPilot_Lab_Update_2026-10-05.docx
+++ b/docs/reports/MagPilot_Lab_Update_2026-10-05.docx
@@ -46,7 +46,7 @@
           <w:sz w:val="22"/>
           <w:color w:val="546675"/>
         </w:rPr>
-        <w:t xml:space="preserve">5 October 2026 · meeting update · paper branch</w:t>
+        <w:t xml:space="preserve">28 September–4 October 2026 · reviewed 5 October · paper branch</w:t>
       </w:r>
     </w:p>
     <w:tbl>
@@ -243,58 +243,58 @@
                 <w:b/>
                 <w:color w:val="174B65"/>
               </w:rPr>
-              <w:t xml:space="preserve">Hardware update</w:t>
-            </w:r>
-          </w:p>
-          <w:p>
-            <w:pPr>
-              <w:spacing w:before="0" w:after="35" w:line="264" w:lineRule="exact"/>
-              <w:keepLines/>
-              <w:numPr>
-                <w:ilvl w:val="0"/>
-                <w:numId w:val="1"/>
-              </w:numPr>
-            </w:pPr>
-            <w:r>
-              <w:rPr>
-                <w:rFonts w:ascii="Liberation Sans" w:hAnsi="Liberation Sans"/>
-                <w:sz w:val="22"/>
-              </w:rPr>
-              <w:t xml:space="preserve">Sensor board repaired; three smaller magnets available for experiments.</w:t>
-            </w:r>
-          </w:p>
-          <w:p>
-            <w:pPr>
-              <w:spacing w:before="0" w:after="35" w:line="264" w:lineRule="exact"/>
-              <w:keepLines/>
-              <w:numPr>
-                <w:ilvl w:val="0"/>
-                <w:numId w:val="1"/>
-              </w:numPr>
-            </w:pPr>
-            <w:r>
-              <w:rPr>
-                <w:rFonts w:ascii="Liberation Sans" w:hAnsi="Liberation Sans"/>
-                <w:sz w:val="22"/>
-              </w:rPr>
-              <w:t xml:space="preserve">Compare one-, two- and three-magnet configurations; document geometry, grade and orientation.</w:t>
-            </w:r>
-          </w:p>
-          <w:p>
-            <w:pPr>
-              <w:spacing w:before="0" w:after="35" w:line="264" w:lineRule="exact"/>
-              <w:keepLines/>
-              <w:numPr>
-                <w:ilvl w:val="0"/>
-                <w:numId w:val="1"/>
-              </w:numPr>
-            </w:pPr>
-            <w:r>
-              <w:rPr>
-                <w:rFonts w:ascii="Liberation Sans" w:hAnsi="Liberation Sans"/>
-                <w:sz w:val="22"/>
-              </w:rPr>
-              <w:t xml:space="preserve">Measure signal/clipping at the writing gap and teleoperation range.</w:t>
+              <w:t xml:space="preserve">Week 2 handoff</w:t>
+            </w:r>
+          </w:p>
+          <w:p>
+            <w:pPr>
+              <w:spacing w:before="0" w:after="35" w:line="264" w:lineRule="exact"/>
+              <w:keepLines/>
+              <w:numPr>
+                <w:ilvl w:val="0"/>
+                <w:numId w:val="1"/>
+              </w:numPr>
+            </w:pPr>
+            <w:r>
+              <w:rPr>
+                <w:rFonts w:ascii="Liberation Sans" w:hAnsi="Liberation Sans"/>
+                <w:sz w:val="22"/>
+              </w:rPr>
+              <w:t xml:space="preserve">Week 2 begins 5 October: board repair and magnet diagnostics.</w:t>
+            </w:r>
+          </w:p>
+          <w:p>
+            <w:pPr>
+              <w:spacing w:before="0" w:after="35" w:line="264" w:lineRule="exact"/>
+              <w:keepLines/>
+              <w:numPr>
+                <w:ilvl w:val="0"/>
+                <w:numId w:val="1"/>
+              </w:numPr>
+            </w:pPr>
+            <w:r>
+              <w:rPr>
+                <w:rFonts w:ascii="Liberation Sans" w:hAnsi="Liberation Sans"/>
+                <w:sz w:val="22"/>
+              </w:rPr>
+              <w:t xml:space="preserve">Compare one-, two- and three-magnet configurations; document geometry and orientation.</w:t>
+            </w:r>
+          </w:p>
+          <w:p>
+            <w:pPr>
+              <w:spacing w:before="0" w:after="35" w:line="264" w:lineRule="exact"/>
+              <w:keepLines/>
+              <w:numPr>
+                <w:ilvl w:val="0"/>
+                <w:numId w:val="1"/>
+              </w:numPr>
+            </w:pPr>
+            <w:r>
+              <w:rPr>
+                <w:rFonts w:ascii="Liberation Sans" w:hAnsi="Liberation Sans"/>
+                <w:sz w:val="22"/>
+              </w:rPr>
+              <w:t xml:space="preserve">Prototype a reloadable pen; check writing and teleoperation heights.</w:t>
             </w:r>
           </w:p>
           <w:p>
@@ -327,7 +327,7 @@
                 <w:rFonts w:ascii="Liberation Sans" w:hAnsi="Liberation Sans"/>
                 <w:sz w:val="22"/>
               </w:rPr>
-              <w:t xml:space="preserve">Start the virtual robot-arm target-reaching pilot now; compare completion times and endpoint errors.</w:t>
+              <w:t xml:space="preserve">Start virtual target reaching in Week 2; log completion times and endpoint errors.</w:t>
             </w:r>
           </w:p>
           <w:p>
@@ -390,7 +390,7 @@
                 <wp:inline distT="0" distB="0" distL="0" distR="0">
                   <wp:extent cx="4892040" cy="1785595"/>
                   <wp:effectExtent l="0" t="0" r="0" b="0"/>
-                  <wp:docPr id="2" name="project_timeline.png" descr="Proposed weeks 1 through 10: virtual target-reaching task and pilot start in week one alongside hardware and recording; setup freeze, formal collection, model and tracking analysis, evaluation, final report and buffer."/>
+                  <wp:docPr id="2" name="project_timeline.png" descr="Proposed weeks 1 through 10: virtual target-reaching task and pilot start in week two alongside hardware and recording; setup freeze, formal collection, model and tracking analysis, evaluation, final report and buffer."/>
                   <wp:cNvGraphicFramePr>
                     <a:graphicFrameLocks noChangeAspect="1"/>
                   </wp:cNvGraphicFramePr>

</xml_diff>